<commit_message>
add several features like vscode indent, duplicate line, move line, zoom in and out
</commit_message>
<xml_diff>
--- a/examples/nama-hewan.docx
+++ b/examples/nama-hewan.docx
@@ -8,43 +8,43 @@
       </w:pPr>
       <w:r>
         <w:rPr/>
-        <w:t xml:space="preserve">Tentu, berikut adalah 4 hewan berkaki dua:</w:t>
-      </w:r>
-    </w:p>
-    <w:p>
-      <w:pPr>
-        <w:rPr/>
-      </w:pPr>
-      <w:r>
-        <w:rPr/>
-        <w:t xml:space="preserve">1.  **Ayam** (Unggas yang sering dipelihara untuk diambil daging dan telurnya)</w:t>
-      </w:r>
-    </w:p>
-    <w:p>
-      <w:pPr>
-        <w:rPr/>
-      </w:pPr>
-      <w:r>
-        <w:rPr/>
-        <w:t xml:space="preserve">2.  **Bebek** (Unggas air yang memiliki paruh pipih dan suka berenang)</w:t>
-      </w:r>
-    </w:p>
-    <w:p>
-      <w:pPr>
-        <w:rPr/>
-      </w:pPr>
-      <w:r>
-        <w:rPr/>
-        <w:t xml:space="preserve">3.  **Burung Elang** (Burung pemangsa yang kuat dan memiliki penglihatan tajam)</w:t>
-      </w:r>
-    </w:p>
-    <w:p>
-      <w:pPr>
-        <w:rPr/>
-      </w:pPr>
-      <w:r>
-        <w:rPr/>
-        <w:t xml:space="preserve">4.  **Kanguru** (Hewan asli Australia yang melompat menggunakan kedua kaki belakangnya yang kuat)</w:t>
+        <w:t xml:space="preserve">Tentu, berikut adalah 4 hewan berkaki 2 (bipedal):</w:t>
+      </w:r>
+    </w:p>
+    <w:p>
+      <w:pPr>
+        <w:rPr/>
+      </w:pPr>
+      <w:r>
+        <w:rPr/>
+        <w:t xml:space="preserve">1.  **Ayam** (unggas yang sering dipelihara untuk diambil daging dan telurnya)</w:t>
+      </w:r>
+    </w:p>
+    <w:p>
+      <w:pPr>
+        <w:rPr/>
+      </w:pPr>
+      <w:r>
+        <w:rPr/>
+        <w:t xml:space="preserve">2.  **Burung Unta** (burung terbesar di dunia yang tidak bisa terbang namun berlari sangat kencang)</w:t>
+      </w:r>
+    </w:p>
+    <w:p>
+      <w:pPr>
+        <w:rPr/>
+      </w:pPr>
+      <w:r>
+        <w:rPr/>
+        <w:t xml:space="preserve">3.  **Kanguru** (hewan asli Australia yang bergerak dengan melompat menggunakan kedua kaki belakangnya yang besar)</w:t>
+      </w:r>
+    </w:p>
+    <w:p>
+      <w:pPr>
+        <w:rPr/>
+      </w:pPr>
+      <w:r>
+        <w:rPr/>
+        <w:t xml:space="preserve">4.  **Manusia** (*Homo sapiens*), yang berjalan tegak sempurna dengan dua kaki sebagai ciri utama spesiesnya</w:t>
       </w:r>
     </w:p>
     <w:sectPr>

</xml_diff>